<commit_message>
fix(manoire/newsletters): corrections dates, géographie, nomenclature
- Dates : "fin juin" → "début juillet" + premiers informés de la date exacte (NL3)
- Géographie : "Chablais" → "Préalpes vaudoises" (NL2, NL5) — Col de Jaman ≠ Chablais
- Anouck : déjà installée au Col, plus "s'apprête à faire son grand retour" (NL1)
- Bon Cadeau : "Fondateur" supprimé → "Bon Cadeau Le Manoïre"
- CTAs NL1 : site remplacé par liens Instagram + Facebook
- NL6 : mention inauguration officielle ajoutée
- generate_newsletters.js : support ctas[] pour CTAs multiples
- DOCX régénéré

Co-Authored-By: Claude Sonnet 4.6 <noreply@anthropic.com>
</commit_message>
<xml_diff>
--- a/projects/manoire/newsletters/newsletters_manoire.docx
+++ b/projects/manoire/newsletters/newsletters_manoire.docx
@@ -162,7 +162,7 @@
           <w:sz w:val="22"/>
           <w:szCs w:val="22"/>
         </w:rPr>
-        <w:t xml:space="preserve">On ne va pas se mentir : on trépigne d'impatience à l'idée de vous accueillir au Manoïre, notre repaire tout neuf au Col de Jaman, perché au-dessus de Montreux avec une vue sur le lac qui donne envie de tout quitter. Et on n'est pas les seuls — Anouck, notre Saint-Bernard maison, qui avait débarqué ici toute chiot il y a quelques mois, s'apprête à faire son grand retour. Double homecoming, double émotion.</w:t>
+        <w:t xml:space="preserve">On ne va pas se mentir : on trépigne d'impatience à l'idée de vous accueillir au Manoïre, notre repaire tout neuf au Col de Jaman, perché au-dessus de Montreux avec une vue sur le lac qui donne envie de tout quitter. Et on n'est pas les seuls — Anouck, notre Saint-Bernard maison, est déjà là, bien installée au Col, à surveiller les travaux de près. Certains chiens gardent la maison. Elle, elle garde le chantier.</w:t>
       </w:r>
     </w:p>
     <w:p>
@@ -179,24 +179,9 @@
     </w:p>
     <w:p>
       <w:pPr>
-        <w:spacing w:after="80" w:before="120"/>
-      </w:pPr>
-      <w:r>
-        <w:rPr>
-          <w:i/>
-          <w:iCs/>
-          <w:color w:val="666666"/>
-          <w:sz w:val="20"/>
-          <w:szCs w:val="20"/>
-        </w:rPr>
-        <w:t xml:space="preserve">PS : Un Bon Cadeau Fondateur avec 15% de remise pointe bientôt le bout de son museau. Anouck valide.</w:t>
-      </w:r>
-    </w:p>
-    <w:p>
-      <w:pPr>
         <w:spacing w:after="200" w:before="120"/>
       </w:pPr>
-      <w:hyperlink w:history="1" r:id="rIdrlpzz9xodtwigoqsvq52h">
+      <w:hyperlink w:history="1" r:id="rIdzzom71qkkqczbqflcae5w">
         <w:r>
           <w:rPr>
             <w:b/>
@@ -206,7 +191,25 @@
             <w:szCs w:val="22"/>
             <w:u w:val="single"/>
           </w:rPr>
-          <w:t xml:space="preserve">👉 Suivez l'aventure : www.lemanoire-jaman.ch</w:t>
+          <w:t xml:space="preserve">📸 Instagram : @le_manoire_jaman</w:t>
+        </w:r>
+      </w:hyperlink>
+    </w:p>
+    <w:p>
+      <w:pPr>
+        <w:spacing w:after="200" w:before="120"/>
+      </w:pPr>
+      <w:hyperlink w:history="1" r:id="rIduqmsayjdqytugwqripwap">
+        <w:r>
+          <w:rPr>
+            <w:b/>
+            <w:bCs/>
+            <w:color w:val="1155CC"/>
+            <w:sz w:val="22"/>
+            <w:szCs w:val="22"/>
+            <w:u w:val="single"/>
+          </w:rPr>
+          <w:t xml:space="preserve">👍 Facebook : Le Manoïre</w:t>
         </w:r>
       </w:hyperlink>
     </w:p>
@@ -270,7 +273,7 @@
           <w:sz w:val="22"/>
           <w:szCs w:val="22"/>
         </w:rPr>
-        <w:t xml:space="preserve">Vous vous demandez ce qui mijote derrière les portes du Manoïre ? Entre fromages affinés du Chablais, herbes cueillies sur les hauteurs et fournisseurs locaux qu'on connaît par leur prénom, on construit quelque chose de vraiment ancré dans ce coin de montagne. Le chef chante faux, mais avec une passion totalement assumée.</w:t>
+        <w:t xml:space="preserve">Vous vous demandez ce qui mijote derrière les portes du Manoïre ? Entre fromages affinés des Préalpes vaudoises, herbes cueillies sur les hauteurs et fournisseurs locaux qu'on connaît par leur prénom, on construit quelque chose de vraiment ancré dans ce coin de montagne. Le chef chante faux, mais avec une passion totalement assumée.</w:t>
       </w:r>
     </w:p>
     <w:p>
@@ -297,14 +300,14 @@
           <w:sz w:val="20"/>
           <w:szCs w:val="20"/>
         </w:rPr>
-        <w:t xml:space="preserve">Le Bon Cadeau Fondateur arrive… patience, randonneurs !</w:t>
+        <w:t xml:space="preserve">Le Bon Cadeau Le Manoïre arrive… patience, randonneurs !</w:t>
       </w:r>
     </w:p>
     <w:p>
       <w:pPr>
         <w:spacing w:after="200" w:before="120"/>
       </w:pPr>
-      <w:hyperlink w:history="1" r:id="rIdxncbxsmcdlk-ckh9omuru">
+      <w:hyperlink w:history="1" r:id="rIds3eskkp54hrbzbhs12ne1">
         <w:r>
           <w:rPr>
             <w:b/>
@@ -378,7 +381,7 @@
           <w:sz w:val="22"/>
           <w:szCs w:val="22"/>
         </w:rPr>
-        <w:t xml:space="preserve">Notez-le dans vos agendas, programmez une alerte, gravez-le dans la roche du Col si nécessaire : l'ouverture du Manoïre, c'est fin juin. On astique les verres, on finalise la carte, et Anouck fait ses valises depuis une semaine (elle est très organisée pour une Saint-Bernard).</w:t>
+        <w:t xml:space="preserve">Notez-le dans vos agendas, programmez une alerte, gravez-le dans la roche du Col si nécessaire : l'ouverture du Manoïre, c'est pour début juillet. La date exacte arrive très bientôt — et vous serez les premiers à en être informés, promis. On astique les verres, on finalise la carte, et Anouck fait ses valises depuis une semaine (elle est très organisée pour une Saint-Bernard).</w:t>
       </w:r>
     </w:p>
     <w:p>
@@ -405,14 +408,14 @@
           <w:sz w:val="20"/>
           <w:szCs w:val="20"/>
         </w:rPr>
-        <w:t xml:space="preserve">Le Bon Cadeau Fondateur est en route… encore un peu de patience !</w:t>
+        <w:t xml:space="preserve">Le Bon Cadeau Le Manoïre est en route… encore un peu de patience !</w:t>
       </w:r>
     </w:p>
     <w:p>
       <w:pPr>
         <w:spacing w:after="200" w:before="120"/>
       </w:pPr>
-      <w:hyperlink w:history="1" r:id="rIdymbybxjbhcfxptjgkqdox">
+      <w:hyperlink w:history="1" r:id="rId57odnn_dq2c0n5nszc4xe">
         <w:r>
           <w:rPr>
             <w:b/>
@@ -486,7 +489,7 @@
           <w:sz w:val="22"/>
           <w:szCs w:val="22"/>
         </w:rPr>
-        <w:t xml:space="preserve">C'est le moment de craquer — pour vous ou pour offrir. Notre Bon Cadeau Fondateur est disponible avec 15% de remise pour fêter l'ouverture du Manoïre. Parfait pour les amateurs de montagne qui méritent une bonne table après une journée sur les sentiers des Rochers de Naye ou du Tour du Lac. Parfait aussi pour tous ceux qui cherchent un cadeau original cet été.</w:t>
+        <w:t xml:space="preserve">C'est le moment de craquer — pour vous ou pour offrir. Notre Bon Cadeau Le Manoïre est disponible avec 15% de remise pour fêter l'ouverture. Parfait pour les amateurs de montagne qui méritent une bonne table après une journée sur les sentiers des Rochers de Naye ou du Tour du Lac. Parfait aussi pour tous ceux qui cherchent un cadeau original cet été.</w:t>
       </w:r>
     </w:p>
     <w:p>
@@ -505,7 +508,7 @@
       <w:pPr>
         <w:spacing w:after="200" w:before="120"/>
       </w:pPr>
-      <w:hyperlink w:history="1" r:id="rIduemfvs6m5inmzixchcxxq">
+      <w:hyperlink w:history="1" r:id="rIdnkmblz0diblfomepseogm">
         <w:r>
           <w:rPr>
             <w:b/>
@@ -515,7 +518,7 @@
             <w:szCs w:val="22"/>
             <w:u w:val="single"/>
           </w:rPr>
-          <w:t xml:space="preserve">👉 Bon Cadeau Fondateur — Le Manoïre, Col de Jaman : www.lemanoire-jaman.ch</w:t>
+          <w:t xml:space="preserve">👉 Bon Cadeau Le Manoïre — Col de Jaman : www.lemanoire-jaman.ch</w:t>
         </w:r>
       </w:hyperlink>
     </w:p>
@@ -579,7 +582,7 @@
           <w:sz w:val="22"/>
           <w:szCs w:val="22"/>
         </w:rPr>
-        <w:t xml:space="preserve">Au Manoïre, on est convaincus que la meilleure cuisine, c'est celle qui raconte un lieu. Et ce lieu, c'est le Col de Jaman — porte d'entrée des Alpes vaudoises, point de départ de randonnées mythiques, et belvédère naturel sur le lac Léman et les Alpes. Les producteurs du Chablais, les artisans de la région, les voisins du col : cette aventure, c'est la leur autant que la nôtre.</w:t>
+        <w:t xml:space="preserve">Au Manoïre, on est convaincus que la meilleure cuisine, c'est celle qui raconte un lieu. Et ce lieu, c'est le Col de Jaman — porte d'entrée des Alpes vaudoises, point de départ de randonnées mythiques, et belvédère naturel sur le lac Léman et les Alpes. Les producteurs des Préalpes vaudoises, les artisans de la région, les voisins du col : cette aventure, c'est la leur autant que la nôtre.</w:t>
       </w:r>
     </w:p>
     <w:p>
@@ -606,14 +609,14 @@
           <w:sz w:val="20"/>
           <w:szCs w:val="20"/>
         </w:rPr>
-        <w:t xml:space="preserve">Le Bon Cadeau Fondateur est toujours là pour les retardataires — 15% de remise, pas longtemps !</w:t>
+        <w:t xml:space="preserve">Le Bon Cadeau Le Manoïre est toujours là pour les retardataires — 15% de remise, pas longtemps !</w:t>
       </w:r>
     </w:p>
     <w:p>
       <w:pPr>
         <w:spacing w:after="200" w:before="120"/>
       </w:pPr>
-      <w:hyperlink w:history="1" r:id="rIdsrtcwl6wyn02cgnb0eqit">
+      <w:hyperlink w:history="1" r:id="rIda2kasmr3zg6g3hkoozw4m">
         <w:r>
           <w:rPr>
             <w:b/>
@@ -711,14 +714,26 @@
           <w:sz w:val="22"/>
           <w:szCs w:val="22"/>
         </w:rPr>
-        <w:t xml:space="preserve">Dernière chance pour profiter du Bon Cadeau Fondateur (15% de remise) :</w:t>
+        <w:t xml:space="preserve">Et ce n'est pas fini — une inauguration officielle est prévue prochainement. On vous réserve une soirée à la hauteur du Col. Restez connectés.</w:t>
+      </w:r>
+    </w:p>
+    <w:p>
+      <w:pPr>
+        <w:spacing w:after="80" w:before="80"/>
+      </w:pPr>
+      <w:r>
+        <w:rPr>
+          <w:sz w:val="22"/>
+          <w:szCs w:val="22"/>
+        </w:rPr>
+        <w:t xml:space="preserve">Dernière chance pour profiter du Bon Cadeau Le Manoïre (15% de remise) :</w:t>
       </w:r>
     </w:p>
     <w:p>
       <w:pPr>
         <w:spacing w:after="200" w:before="120"/>
       </w:pPr>
-      <w:hyperlink w:history="1" r:id="rIdpyauasl7t4tzihd5sww6k">
+      <w:hyperlink w:history="1" r:id="rIdk0ub73awdlkiyuvh9kxrc">
         <w:r>
           <w:rPr>
             <w:b/>

</xml_diff>